<commit_message>
feat: add PhilHealth transmittal service and DOCX generation
- Implemented `philhealthTransmittalService` for managing selected seniors and settings.
- Created `masterlistDocxGenerator` for generating ECA Beneficiaries Masterlist DOCX files.
- Developed `philhealthTransmittalDocxGenerator` for generating PhilHealth Transmittal DOCX files.
- Added SQL schema for `philhealth_transmittal_seniors` and `philhealth_transmittal_settings` tables with necessary policies and default settings.
</commit_message>
<xml_diff>
--- a/public/docs/BLANK-FORM-ECA-BENES.docx
+++ b/public/docs/BLANK-FORM-ECA-BENES.docx
@@ -3779,30 +3779,10 @@
           <w:u w:val="single"/>
           <w:lang w:val="en-US"/>
         </w:rPr>
-        <w:t>{{</w:t>
+        <w:t>{{OSCA_Head}}</w:t>
       </w:r>
       <w:proofErr w:type="spellStart"/>
-      <w:r>
-        <w:rPr>
-          <w:rFonts w:ascii="Courier New" w:hAnsi="Courier New" w:cs="Courier New"/>
-          <w:b/>
-          <w:bCs/>
-          <w:u w:val="single"/>
-          <w:lang w:val="en-US"/>
-        </w:rPr>
-        <w:t>OSCA_Head</w:t>
-      </w:r>
       <w:proofErr w:type="spellEnd"/>
-      <w:r>
-        <w:rPr>
-          <w:rFonts w:ascii="Courier New" w:hAnsi="Courier New" w:cs="Courier New"/>
-          <w:b/>
-          <w:bCs/>
-          <w:u w:val="single"/>
-          <w:lang w:val="en-US"/>
-        </w:rPr>
-        <w:t>}}</w:t>
-      </w:r>
     </w:p>
     <w:p>
       <w:pPr>

</xml_diff>